<commit_message>
added summary reports updated- management and technical
</commit_message>
<xml_diff>
--- a/docs/Biodata_Builder_Management_Report.docx
+++ b/docs/Biodata_Builder_Management_Report.docx
@@ -156,25 +156,330 @@
         <w:t xml:space="preserve">Table of Contents</w:t>
       </w:r>
     </w:p>
-    <w:sdt>
-      <w:sdtPr>
-        <w:alias w:val="Table of Contents"/>
-      </w:sdtPr>
-      <w:sdtContent>
-        <w:p>
-          <w:r>
-            <w:fldChar w:fldCharType="begin" w:dirty="true"/>
-            <w:instrText xml:space="preserve">TOC \h \o "1-2"</w:instrText>
-            <w:fldChar w:fldCharType="separate"/>
-          </w:r>
-        </w:p>
-        <w:p>
-          <w:r>
-            <w:fldChar w:fldCharType="end"/>
-          </w:r>
-        </w:p>
-      </w:sdtContent>
-    </w:sdt>
+    <w:p>
+      <w:pPr>
+        <w:tabs>
+          <w:tab w:val="right" w:pos="9350" w:leader="dot"/>
+        </w:tabs>
+        <w:spacing w:after="140"/>
+      </w:pPr>
+      <w:r>
+        <w:rPr>
+          <w:rFonts w:ascii="Calibri" w:cs="Calibri" w:eastAsia="Calibri" w:hAnsi="Calibri"/>
+          <w:sz w:val="22"/>
+          <w:szCs w:val="22"/>
+        </w:rPr>
+        <w:t xml:space="preserve">1. Executive Summary</w:t>
+      </w:r>
+      <w:r>
+        <w:ptab w:alignment="right" w:relativeTo="margin" w:leader="dot"/>
+      </w:r>
+      <w:r>
+        <w:rPr>
+          <w:rFonts w:ascii="Calibri" w:cs="Calibri" w:eastAsia="Calibri" w:hAnsi="Calibri"/>
+          <w:sz w:val="22"/>
+          <w:szCs w:val="22"/>
+        </w:rPr>
+        <w:t xml:space="preserve">3</w:t>
+      </w:r>
+    </w:p>
+    <w:p>
+      <w:pPr>
+        <w:tabs>
+          <w:tab w:val="right" w:pos="9350" w:leader="dot"/>
+        </w:tabs>
+        <w:spacing w:after="140"/>
+      </w:pPr>
+      <w:r>
+        <w:rPr>
+          <w:rFonts w:ascii="Calibri" w:cs="Calibri" w:eastAsia="Calibri" w:hAnsi="Calibri"/>
+          <w:sz w:val="22"/>
+          <w:szCs w:val="22"/>
+        </w:rPr>
+        <w:t xml:space="preserve">2. What This Product Actually Is</w:t>
+      </w:r>
+      <w:r>
+        <w:ptab w:alignment="right" w:relativeTo="margin" w:leader="dot"/>
+      </w:r>
+      <w:r>
+        <w:rPr>
+          <w:rFonts w:ascii="Calibri" w:cs="Calibri" w:eastAsia="Calibri" w:hAnsi="Calibri"/>
+          <w:sz w:val="22"/>
+          <w:szCs w:val="22"/>
+        </w:rPr>
+        <w:t xml:space="preserve">4</w:t>
+      </w:r>
+    </w:p>
+    <w:p>
+      <w:pPr>
+        <w:tabs>
+          <w:tab w:val="right" w:pos="9350" w:leader="dot"/>
+        </w:tabs>
+        <w:spacing w:after="140"/>
+      </w:pPr>
+      <w:r>
+        <w:rPr>
+          <w:rFonts w:ascii="Calibri" w:cs="Calibri" w:eastAsia="Calibri" w:hAnsi="Calibri"/>
+          <w:sz w:val="22"/>
+          <w:szCs w:val="22"/>
+        </w:rPr>
+        <w:t xml:space="preserve">3. How the Product Works (Customer Journey)</w:t>
+      </w:r>
+      <w:r>
+        <w:ptab w:alignment="right" w:relativeTo="margin" w:leader="dot"/>
+      </w:r>
+      <w:r>
+        <w:rPr>
+          <w:rFonts w:ascii="Calibri" w:cs="Calibri" w:eastAsia="Calibri" w:hAnsi="Calibri"/>
+          <w:sz w:val="22"/>
+          <w:szCs w:val="22"/>
+        </w:rPr>
+        <w:t xml:space="preserve">4</w:t>
+      </w:r>
+    </w:p>
+    <w:p>
+      <w:pPr>
+        <w:tabs>
+          <w:tab w:val="right" w:pos="9350" w:leader="dot"/>
+        </w:tabs>
+        <w:spacing w:after="140"/>
+      </w:pPr>
+      <w:r>
+        <w:rPr>
+          <w:rFonts w:ascii="Calibri" w:cs="Calibri" w:eastAsia="Calibri" w:hAnsi="Calibri"/>
+          <w:sz w:val="22"/>
+          <w:szCs w:val="22"/>
+        </w:rPr>
+        <w:t xml:space="preserve">4. Where It Runs (Platforms Used)</w:t>
+      </w:r>
+      <w:r>
+        <w:ptab w:alignment="right" w:relativeTo="margin" w:leader="dot"/>
+      </w:r>
+      <w:r>
+        <w:rPr>
+          <w:rFonts w:ascii="Calibri" w:cs="Calibri" w:eastAsia="Calibri" w:hAnsi="Calibri"/>
+          <w:sz w:val="22"/>
+          <w:szCs w:val="22"/>
+        </w:rPr>
+        <w:t xml:space="preserve">5</w:t>
+      </w:r>
+    </w:p>
+    <w:p>
+      <w:pPr>
+        <w:tabs>
+          <w:tab w:val="right" w:pos="9350" w:leader="dot"/>
+        </w:tabs>
+        <w:spacing w:after="140"/>
+      </w:pPr>
+      <w:r>
+        <w:rPr>
+          <w:rFonts w:ascii="Calibri" w:cs="Calibri" w:eastAsia="Calibri" w:hAnsi="Calibri"/>
+          <w:sz w:val="22"/>
+          <w:szCs w:val="22"/>
+        </w:rPr>
+        <w:t xml:space="preserve">5. What Data Is Collected &amp; Stored</w:t>
+      </w:r>
+      <w:r>
+        <w:ptab w:alignment="right" w:relativeTo="margin" w:leader="dot"/>
+      </w:r>
+      <w:r>
+        <w:rPr>
+          <w:rFonts w:ascii="Calibri" w:cs="Calibri" w:eastAsia="Calibri" w:hAnsi="Calibri"/>
+          <w:sz w:val="22"/>
+          <w:szCs w:val="22"/>
+        </w:rPr>
+        <w:t xml:space="preserve">6</w:t>
+      </w:r>
+    </w:p>
+    <w:p>
+      <w:pPr>
+        <w:tabs>
+          <w:tab w:val="right" w:pos="9350" w:leader="dot"/>
+        </w:tabs>
+        <w:spacing w:after="140"/>
+      </w:pPr>
+      <w:r>
+        <w:rPr>
+          <w:rFonts w:ascii="Calibri" w:cs="Calibri" w:eastAsia="Calibri" w:hAnsi="Calibri"/>
+          <w:sz w:val="22"/>
+          <w:szCs w:val="22"/>
+        </w:rPr>
+        <w:t xml:space="preserve">6. How Much Traffic / Crowd Can It Handle Today?</w:t>
+      </w:r>
+      <w:r>
+        <w:ptab w:alignment="right" w:relativeTo="margin" w:leader="dot"/>
+      </w:r>
+      <w:r>
+        <w:rPr>
+          <w:rFonts w:ascii="Calibri" w:cs="Calibri" w:eastAsia="Calibri" w:hAnsi="Calibri"/>
+          <w:sz w:val="22"/>
+          <w:szCs w:val="22"/>
+        </w:rPr>
+        <w:t xml:space="preserve">6</w:t>
+      </w:r>
+    </w:p>
+    <w:p>
+      <w:pPr>
+        <w:tabs>
+          <w:tab w:val="right" w:pos="9350" w:leader="dot"/>
+        </w:tabs>
+        <w:spacing w:after="140"/>
+      </w:pPr>
+      <w:r>
+        <w:rPr>
+          <w:rFonts w:ascii="Calibri" w:cs="Calibri" w:eastAsia="Calibri" w:hAnsi="Calibri"/>
+          <w:sz w:val="22"/>
+          <w:szCs w:val="22"/>
+        </w:rPr>
+        <w:t xml:space="preserve">7. Money: Running Costs, Investment Needed &amp; Income Potential</w:t>
+      </w:r>
+      <w:r>
+        <w:ptab w:alignment="right" w:relativeTo="margin" w:leader="dot"/>
+      </w:r>
+      <w:r>
+        <w:rPr>
+          <w:rFonts w:ascii="Calibri" w:cs="Calibri" w:eastAsia="Calibri" w:hAnsi="Calibri"/>
+          <w:sz w:val="22"/>
+          <w:szCs w:val="22"/>
+        </w:rPr>
+        <w:t xml:space="preserve">7</w:t>
+      </w:r>
+    </w:p>
+    <w:p>
+      <w:pPr>
+        <w:tabs>
+          <w:tab w:val="right" w:pos="9350" w:leader="dot"/>
+        </w:tabs>
+        <w:spacing w:after="140"/>
+      </w:pPr>
+      <w:r>
+        <w:rPr>
+          <w:rFonts w:ascii="Calibri" w:cs="Calibri" w:eastAsia="Calibri" w:hAnsi="Calibri"/>
+          <w:sz w:val="22"/>
+          <w:szCs w:val="22"/>
+        </w:rPr>
+        <w:t xml:space="preserve">8. Is It Safe? (Security, in Plain Language)</w:t>
+      </w:r>
+      <w:r>
+        <w:ptab w:alignment="right" w:relativeTo="margin" w:leader="dot"/>
+      </w:r>
+      <w:r>
+        <w:rPr>
+          <w:rFonts w:ascii="Calibri" w:cs="Calibri" w:eastAsia="Calibri" w:hAnsi="Calibri"/>
+          <w:sz w:val="22"/>
+          <w:szCs w:val="22"/>
+        </w:rPr>
+        <w:t xml:space="preserve">9</w:t>
+      </w:r>
+    </w:p>
+    <w:p>
+      <w:pPr>
+        <w:tabs>
+          <w:tab w:val="right" w:pos="9350" w:leader="dot"/>
+        </w:tabs>
+        <w:spacing w:after="140"/>
+      </w:pPr>
+      <w:r>
+        <w:rPr>
+          <w:rFonts w:ascii="Calibri" w:cs="Calibri" w:eastAsia="Calibri" w:hAnsi="Calibri"/>
+          <w:sz w:val="22"/>
+          <w:szCs w:val="22"/>
+        </w:rPr>
+        <w:t xml:space="preserve">9. What’s Working Well</w:t>
+      </w:r>
+      <w:r>
+        <w:ptab w:alignment="right" w:relativeTo="margin" w:leader="dot"/>
+      </w:r>
+      <w:r>
+        <w:rPr>
+          <w:rFonts w:ascii="Calibri" w:cs="Calibri" w:eastAsia="Calibri" w:hAnsi="Calibri"/>
+          <w:sz w:val="22"/>
+          <w:szCs w:val="22"/>
+        </w:rPr>
+        <w:t xml:space="preserve">10</w:t>
+      </w:r>
+    </w:p>
+    <w:p>
+      <w:pPr>
+        <w:tabs>
+          <w:tab w:val="right" w:pos="9350" w:leader="dot"/>
+        </w:tabs>
+        <w:spacing w:after="140"/>
+      </w:pPr>
+      <w:r>
+        <w:rPr>
+          <w:rFonts w:ascii="Calibri" w:cs="Calibri" w:eastAsia="Calibri" w:hAnsi="Calibri"/>
+          <w:sz w:val="22"/>
+          <w:szCs w:val="22"/>
+        </w:rPr>
+        <w:t xml:space="preserve">10. What’s Missing or Could Be Improved</w:t>
+      </w:r>
+      <w:r>
+        <w:ptab w:alignment="right" w:relativeTo="margin" w:leader="dot"/>
+      </w:r>
+      <w:r>
+        <w:rPr>
+          <w:rFonts w:ascii="Calibri" w:cs="Calibri" w:eastAsia="Calibri" w:hAnsi="Calibri"/>
+          <w:sz w:val="22"/>
+          <w:szCs w:val="22"/>
+        </w:rPr>
+        <w:t xml:space="preserve">10</w:t>
+      </w:r>
+    </w:p>
+    <w:p>
+      <w:pPr>
+        <w:tabs>
+          <w:tab w:val="right" w:pos="9350" w:leader="dot"/>
+        </w:tabs>
+        <w:spacing w:after="140"/>
+      </w:pPr>
+      <w:r>
+        <w:rPr>
+          <w:rFonts w:ascii="Calibri" w:cs="Calibri" w:eastAsia="Calibri" w:hAnsi="Calibri"/>
+          <w:sz w:val="22"/>
+          <w:szCs w:val="22"/>
+        </w:rPr>
+        <w:t xml:space="preserve">11. Recommendations &amp; Suggested Next Steps</w:t>
+      </w:r>
+      <w:r>
+        <w:ptab w:alignment="right" w:relativeTo="margin" w:leader="dot"/>
+      </w:r>
+      <w:r>
+        <w:rPr>
+          <w:rFonts w:ascii="Calibri" w:cs="Calibri" w:eastAsia="Calibri" w:hAnsi="Calibri"/>
+          <w:sz w:val="22"/>
+          <w:szCs w:val="22"/>
+        </w:rPr>
+        <w:t xml:space="preserve">11</w:t>
+      </w:r>
+    </w:p>
+    <w:p>
+      <w:pPr>
+        <w:tabs>
+          <w:tab w:val="right" w:pos="9350" w:leader="dot"/>
+        </w:tabs>
+        <w:spacing w:after="140"/>
+      </w:pPr>
+      <w:r>
+        <w:rPr>
+          <w:rFonts w:ascii="Calibri" w:cs="Calibri" w:eastAsia="Calibri" w:hAnsi="Calibri"/>
+          <w:sz w:val="22"/>
+          <w:szCs w:val="22"/>
+        </w:rPr>
+        <w:t xml:space="preserve">12. Glossary (Plain-Language Terms Used in This Report)</w:t>
+      </w:r>
+      <w:r>
+        <w:ptab w:alignment="right" w:relativeTo="margin" w:leader="dot"/>
+      </w:r>
+      <w:r>
+        <w:rPr>
+          <w:rFonts w:ascii="Calibri" w:cs="Calibri" w:eastAsia="Calibri" w:hAnsi="Calibri"/>
+          <w:sz w:val="22"/>
+          <w:szCs w:val="22"/>
+        </w:rPr>
+        <w:t xml:space="preserve">11</w:t>
+      </w:r>
+    </w:p>
     <w:p>
       <w:r>
         <w:br w:type="page"/>

</xml_diff>